<commit_message>
Update skill reference docs for deal workflow standards
</commit_message>
<xml_diff>
--- a/docs/Claude_Skill_Library_External (Finance)_v6.docx
+++ b/docs/Claude_Skill_Library_External (Finance)_v6.docx
@@ -774,6 +774,72 @@
                 <w:color w:val="000000"/>
                 <w:sz w:val="16"/>
               </w:rPr>
+              <w:t>Evidence And Footnote Standard</w:t>
+            </w:r>
+          </w:p>
+        </w:tc>
+      </w:tr>
+      <w:tr>
+        <w:tc>
+          <w:tcPr>
+            <w:tcW w:type="dxa" w:w="900"/>
+            <w:tcBorders>
+              <w:top w:val="single" w:sz="4" w:space="0" w:color="DDDDDD"/>
+              <w:left w:val="single" w:sz="4" w:space="0" w:color="DDDDDD"/>
+              <w:bottom w:val="single" w:sz="4" w:space="0" w:color="DDDDDD"/>
+              <w:right w:val="single" w:sz="4" w:space="0" w:color="DDDDDD"/>
+            </w:tcBorders>
+            <w:tcMar>
+              <w:top w:w="80" w:type="dxa"/>
+              <w:left w:w="120" w:type="dxa"/>
+              <w:bottom w:w="80" w:type="dxa"/>
+              <w:right w:w="120" w:type="dxa"/>
+            </w:tcMar>
+            <w:vAlign w:val="center"/>
+          </w:tcPr>
+          <w:p>
+            <w:pPr>
+              <w:spacing w:after="0"/>
+            </w:pPr>
+            <w:r>
+              <w:rPr>
+                <w:rFonts w:ascii="Wix Madefor Display" w:hAnsi="Wix Madefor Display" w:eastAsia="Wix Madefor Display"/>
+                <w:b w:val="0"/>
+                <w:color w:val="000000"/>
+                <w:sz w:val="16"/>
+              </w:rPr>
+              <w:t>10</w:t>
+            </w:r>
+          </w:p>
+        </w:tc>
+        <w:tc>
+          <w:tcPr>
+            <w:tcW w:type="dxa" w:w="9900"/>
+            <w:tcBorders>
+              <w:top w:val="single" w:sz="4" w:space="0" w:color="DDDDDD"/>
+              <w:left w:val="single" w:sz="4" w:space="0" w:color="DDDDDD"/>
+              <w:bottom w:val="single" w:sz="4" w:space="0" w:color="DDDDDD"/>
+              <w:right w:val="single" w:sz="4" w:space="0" w:color="DDDDDD"/>
+            </w:tcBorders>
+            <w:tcMar>
+              <w:top w:w="80" w:type="dxa"/>
+              <w:left w:w="120" w:type="dxa"/>
+              <w:bottom w:w="80" w:type="dxa"/>
+              <w:right w:w="120" w:type="dxa"/>
+            </w:tcMar>
+            <w:vAlign w:val="center"/>
+          </w:tcPr>
+          <w:p>
+            <w:pPr>
+              <w:spacing w:after="0"/>
+            </w:pPr>
+            <w:r>
+              <w:rPr>
+                <w:rFonts w:ascii="Wix Madefor Display" w:hAnsi="Wix Madefor Display" w:eastAsia="Wix Madefor Display"/>
+                <w:b w:val="0"/>
+                <w:color w:val="000000"/>
+                <w:sz w:val="16"/>
+              </w:rPr>
               <w:t>Common Mistakes</w:t>
             </w:r>
           </w:p>
@@ -1402,7 +1468,7 @@
                 <w:color w:val="000000"/>
                 <w:sz w:val="16"/>
               </w:rPr>
-              <w:t>Hardens prose, claims, adverse cases, and failure modes before production.</w:t>
+              <w:t>Hardens prose, claims, evidence tags, adverse cases, and failure modes before production.</w:t>
             </w:r>
           </w:p>
         </w:tc>
@@ -1500,7 +1566,7 @@
                 <w:color w:val="000000"/>
                 <w:sz w:val="16"/>
               </w:rPr>
-              <w:t>Produces branded output files only after quality layers are complete.</w:t>
+              <w:t>Produces branded output files only after quality layers are complete; Pattern DOCX uses true Word footnotes for thesis-critical sources.</w:t>
             </w:r>
           </w:p>
         </w:tc>
@@ -3809,7 +3875,7 @@
                 <w:color w:val="000000"/>
                 <w:sz w:val="16"/>
               </w:rPr>
-              <w:t>Formal files require prose hardening, claim integrity, and final QA.</w:t>
+              <w:t>Formal files require prose hardening, claim integrity, true Word footnotes, and final QA.</w:t>
             </w:r>
           </w:p>
         </w:tc>
@@ -4535,7 +4601,7 @@
                 <w:color w:val="000000"/>
                 <w:sz w:val="16"/>
               </w:rPr>
-              <w:t>Pattern DOCX with zero critical QA issues.</w:t>
+              <w:t>Pattern DOCX with true Word footnotes and zero critical QA issues.</w:t>
             </w:r>
           </w:p>
         </w:tc>
@@ -5342,7 +5408,7 @@
                 <w:color w:val="000000"/>
                 <w:sz w:val="16"/>
               </w:rPr>
-              <w:t>Generate Pattern DOCX and run doc-quality-checker.</w:t>
+              <w:t>Generate Pattern DOCX with true Word footnotes and run doc-quality-checker.</w:t>
             </w:r>
           </w:p>
         </w:tc>
@@ -7403,6 +7469,438 @@
           <w:color w:val="4280F4"/>
           <w:sz w:val="24"/>
         </w:rPr>
+        <w:t>Evidence And Footnote Standard</w:t>
+      </w:r>
+    </w:p>
+    <w:tbl>
+      <w:tblPr>
+        <w:tblW w:type="auto" w:w="0"/>
+        <w:jc w:val="center"/>
+        <w:tblLook w:firstColumn="1" w:firstRow="1" w:lastColumn="0" w:lastRow="0" w:noHBand="0" w:noVBand="1" w:val="04A0"/>
+      </w:tblPr>
+      <w:tblGrid>
+        <w:gridCol w:w="5400"/>
+        <w:gridCol w:w="5400"/>
+      </w:tblGrid>
+      <w:tr>
+        <w:trPr>
+          <w:tblHeader w:val="true"/>
+        </w:trPr>
+        <w:tc>
+          <w:tcPr>
+            <w:tcW w:type="dxa" w:w="3300"/>
+            <w:shd w:fill="0F4761"/>
+            <w:tcBorders>
+              <w:top w:val="single" w:sz="4" w:space="0" w:color="DDDDDD"/>
+              <w:left w:val="single" w:sz="4" w:space="0" w:color="DDDDDD"/>
+              <w:bottom w:val="single" w:sz="4" w:space="0" w:color="DDDDDD"/>
+              <w:right w:val="single" w:sz="4" w:space="0" w:color="DDDDDD"/>
+            </w:tcBorders>
+            <w:tcMar>
+              <w:top w:w="80" w:type="dxa"/>
+              <w:left w:w="120" w:type="dxa"/>
+              <w:bottom w:w="80" w:type="dxa"/>
+              <w:right w:w="120" w:type="dxa"/>
+            </w:tcMar>
+          </w:tcPr>
+          <w:p>
+            <w:pPr>
+              <w:spacing w:after="0"/>
+            </w:pPr>
+            <w:r>
+              <w:rPr>
+                <w:rFonts w:ascii="Wix Madefor Display SemiBold" w:hAnsi="Wix Madefor Display SemiBold" w:eastAsia="Wix Madefor Display SemiBold"/>
+                <w:b/>
+                <w:color w:val="FFFFFF"/>
+                <w:sz w:val="16"/>
+              </w:rPr>
+              <w:t>Standard</w:t>
+            </w:r>
+          </w:p>
+        </w:tc>
+        <w:tc>
+          <w:tcPr>
+            <w:tcW w:type="dxa" w:w="7500"/>
+            <w:shd w:fill="0F4761"/>
+            <w:tcBorders>
+              <w:top w:val="single" w:sz="4" w:space="0" w:color="DDDDDD"/>
+              <w:left w:val="single" w:sz="4" w:space="0" w:color="DDDDDD"/>
+              <w:bottom w:val="single" w:sz="4" w:space="0" w:color="DDDDDD"/>
+              <w:right w:val="single" w:sz="4" w:space="0" w:color="DDDDDD"/>
+            </w:tcBorders>
+            <w:tcMar>
+              <w:top w:w="80" w:type="dxa"/>
+              <w:left w:w="120" w:type="dxa"/>
+              <w:bottom w:w="80" w:type="dxa"/>
+              <w:right w:w="120" w:type="dxa"/>
+            </w:tcMar>
+          </w:tcPr>
+          <w:p>
+            <w:pPr>
+              <w:spacing w:after="0"/>
+            </w:pPr>
+            <w:r>
+              <w:rPr>
+                <w:rFonts w:ascii="Wix Madefor Display SemiBold" w:hAnsi="Wix Madefor Display SemiBold" w:eastAsia="Wix Madefor Display SemiBold"/>
+                <w:b/>
+                <w:color w:val="FFFFFF"/>
+                <w:sz w:val="16"/>
+              </w:rPr>
+              <w:t>Rule</w:t>
+            </w:r>
+          </w:p>
+        </w:tc>
+      </w:tr>
+      <w:tr>
+        <w:tc>
+          <w:tcPr>
+            <w:tcW w:type="dxa" w:w="3300"/>
+            <w:tcBorders>
+              <w:top w:val="single" w:sz="4" w:space="0" w:color="DDDDDD"/>
+              <w:left w:val="single" w:sz="4" w:space="0" w:color="DDDDDD"/>
+              <w:bottom w:val="single" w:sz="4" w:space="0" w:color="DDDDDD"/>
+              <w:right w:val="single" w:sz="4" w:space="0" w:color="DDDDDD"/>
+            </w:tcBorders>
+            <w:tcMar>
+              <w:top w:w="80" w:type="dxa"/>
+              <w:left w:w="120" w:type="dxa"/>
+              <w:bottom w:w="80" w:type="dxa"/>
+              <w:right w:w="120" w:type="dxa"/>
+            </w:tcMar>
+            <w:shd w:fill="F5F8FF"/>
+            <w:vAlign w:val="center"/>
+          </w:tcPr>
+          <w:p>
+            <w:pPr>
+              <w:spacing w:after="0"/>
+            </w:pPr>
+            <w:r>
+              <w:rPr>
+                <w:rFonts w:ascii="Wix Madefor Display" w:hAnsi="Wix Madefor Display" w:eastAsia="Wix Madefor Display"/>
+                <w:b w:val="0"/>
+                <w:color w:val="000000"/>
+                <w:sz w:val="16"/>
+              </w:rPr>
+              <w:t>Full deal quality gate</w:t>
+            </w:r>
+          </w:p>
+        </w:tc>
+        <w:tc>
+          <w:tcPr>
+            <w:tcW w:type="dxa" w:w="7500"/>
+            <w:tcBorders>
+              <w:top w:val="single" w:sz="4" w:space="0" w:color="DDDDDD"/>
+              <w:left w:val="single" w:sz="4" w:space="0" w:color="DDDDDD"/>
+              <w:bottom w:val="single" w:sz="4" w:space="0" w:color="DDDDDD"/>
+              <w:right w:val="single" w:sz="4" w:space="0" w:color="DDDDDD"/>
+            </w:tcBorders>
+            <w:tcMar>
+              <w:top w:w="80" w:type="dxa"/>
+              <w:left w:w="120" w:type="dxa"/>
+              <w:bottom w:w="80" w:type="dxa"/>
+              <w:right w:w="120" w:type="dxa"/>
+            </w:tcMar>
+            <w:shd w:fill="F5F8FF"/>
+            <w:vAlign w:val="center"/>
+          </w:tcPr>
+          <w:p>
+            <w:pPr>
+              <w:spacing w:after="0"/>
+            </w:pPr>
+            <w:r>
+              <w:rPr>
+                <w:rFonts w:ascii="Wix Madefor Display" w:hAnsi="Wix Madefor Display" w:eastAsia="Wix Madefor Display"/>
+                <w:b w:val="0"/>
+                <w:color w:val="000000"/>
+                <w:sz w:val="16"/>
+              </w:rPr>
+              <w:t>Load new-deal-pipeline/quality-contract.md before research starts. Use SOURCE_STRICTNESS=strict unless explicitly relaxed.</w:t>
+            </w:r>
+          </w:p>
+        </w:tc>
+      </w:tr>
+      <w:tr>
+        <w:tc>
+          <w:tcPr>
+            <w:tcW w:type="dxa" w:w="3300"/>
+            <w:tcBorders>
+              <w:top w:val="single" w:sz="4" w:space="0" w:color="DDDDDD"/>
+              <w:left w:val="single" w:sz="4" w:space="0" w:color="DDDDDD"/>
+              <w:bottom w:val="single" w:sz="4" w:space="0" w:color="DDDDDD"/>
+              <w:right w:val="single" w:sz="4" w:space="0" w:color="DDDDDD"/>
+            </w:tcBorders>
+            <w:tcMar>
+              <w:top w:w="80" w:type="dxa"/>
+              <w:left w:w="120" w:type="dxa"/>
+              <w:bottom w:w="80" w:type="dxa"/>
+              <w:right w:w="120" w:type="dxa"/>
+            </w:tcMar>
+            <w:vAlign w:val="center"/>
+          </w:tcPr>
+          <w:p>
+            <w:pPr>
+              <w:spacing w:after="0"/>
+            </w:pPr>
+            <w:r>
+              <w:rPr>
+                <w:rFonts w:ascii="Wix Madefor Display" w:hAnsi="Wix Madefor Display" w:eastAsia="Wix Madefor Display"/>
+                <w:b w:val="0"/>
+                <w:color w:val="000000"/>
+                <w:sz w:val="16"/>
+              </w:rPr>
+              <w:t>Evidence tags</w:t>
+            </w:r>
+          </w:p>
+        </w:tc>
+        <w:tc>
+          <w:tcPr>
+            <w:tcW w:type="dxa" w:w="7500"/>
+            <w:tcBorders>
+              <w:top w:val="single" w:sz="4" w:space="0" w:color="DDDDDD"/>
+              <w:left w:val="single" w:sz="4" w:space="0" w:color="DDDDDD"/>
+              <w:bottom w:val="single" w:sz="4" w:space="0" w:color="DDDDDD"/>
+              <w:right w:val="single" w:sz="4" w:space="0" w:color="DDDDDD"/>
+            </w:tcBorders>
+            <w:tcMar>
+              <w:top w:w="80" w:type="dxa"/>
+              <w:left w:w="120" w:type="dxa"/>
+              <w:bottom w:w="80" w:type="dxa"/>
+              <w:right w:w="120" w:type="dxa"/>
+            </w:tcMar>
+            <w:vAlign w:val="center"/>
+          </w:tcPr>
+          <w:p>
+            <w:pPr>
+              <w:spacing w:after="0"/>
+            </w:pPr>
+            <w:r>
+              <w:rPr>
+                <w:rFonts w:ascii="Wix Madefor Display" w:hAnsi="Wix Madefor Display" w:eastAsia="Wix Madefor Display"/>
+                <w:b w:val="0"/>
+                <w:color w:val="000000"/>
+                <w:sz w:val="16"/>
+              </w:rPr>
+              <w:t>Use [F · H]-style tags for thesis-critical evidence. Type = fact / estimate / hypothesis. Confidence = high / medium / low.</w:t>
+            </w:r>
+          </w:p>
+        </w:tc>
+      </w:tr>
+      <w:tr>
+        <w:tc>
+          <w:tcPr>
+            <w:tcW w:type="dxa" w:w="3300"/>
+            <w:tcBorders>
+              <w:top w:val="single" w:sz="4" w:space="0" w:color="DDDDDD"/>
+              <w:left w:val="single" w:sz="4" w:space="0" w:color="DDDDDD"/>
+              <w:bottom w:val="single" w:sz="4" w:space="0" w:color="DDDDDD"/>
+              <w:right w:val="single" w:sz="4" w:space="0" w:color="DDDDDD"/>
+            </w:tcBorders>
+            <w:tcMar>
+              <w:top w:w="80" w:type="dxa"/>
+              <w:left w:w="120" w:type="dxa"/>
+              <w:bottom w:w="80" w:type="dxa"/>
+              <w:right w:w="120" w:type="dxa"/>
+            </w:tcMar>
+            <w:shd w:fill="F5F8FF"/>
+            <w:vAlign w:val="center"/>
+          </w:tcPr>
+          <w:p>
+            <w:pPr>
+              <w:spacing w:after="0"/>
+            </w:pPr>
+            <w:r>
+              <w:rPr>
+                <w:rFonts w:ascii="Wix Madefor Display" w:hAnsi="Wix Madefor Display" w:eastAsia="Wix Madefor Display"/>
+                <w:b w:val="0"/>
+                <w:color w:val="000000"/>
+                <w:sz w:val="16"/>
+              </w:rPr>
+              <w:t>True Word footnotes</w:t>
+            </w:r>
+          </w:p>
+        </w:tc>
+        <w:tc>
+          <w:tcPr>
+            <w:tcW w:type="dxa" w:w="7500"/>
+            <w:tcBorders>
+              <w:top w:val="single" w:sz="4" w:space="0" w:color="DDDDDD"/>
+              <w:left w:val="single" w:sz="4" w:space="0" w:color="DDDDDD"/>
+              <w:bottom w:val="single" w:sz="4" w:space="0" w:color="DDDDDD"/>
+              <w:right w:val="single" w:sz="4" w:space="0" w:color="DDDDDD"/>
+            </w:tcBorders>
+            <w:tcMar>
+              <w:top w:w="80" w:type="dxa"/>
+              <w:left w:w="120" w:type="dxa"/>
+              <w:bottom w:w="80" w:type="dxa"/>
+              <w:right w:w="120" w:type="dxa"/>
+            </w:tcMar>
+            <w:shd w:fill="F5F8FF"/>
+            <w:vAlign w:val="center"/>
+          </w:tcPr>
+          <w:p>
+            <w:pPr>
+              <w:spacing w:after="0"/>
+            </w:pPr>
+            <w:r>
+              <w:rPr>
+                <w:rFonts w:ascii="Wix Madefor Display" w:hAnsi="Wix Madefor Display" w:eastAsia="Wix Madefor Display"/>
+                <w:b w:val="0"/>
+                <w:color w:val="000000"/>
+                <w:sz w:val="16"/>
+              </w:rPr>
+              <w:t>Pattern DOCX outputs must use body w:footnoteReference runs mapped to word/footnotes.xml for thesis-critical sources.</w:t>
+            </w:r>
+          </w:p>
+        </w:tc>
+      </w:tr>
+      <w:tr>
+        <w:tc>
+          <w:tcPr>
+            <w:tcW w:type="dxa" w:w="3300"/>
+            <w:tcBorders>
+              <w:top w:val="single" w:sz="4" w:space="0" w:color="DDDDDD"/>
+              <w:left w:val="single" w:sz="4" w:space="0" w:color="DDDDDD"/>
+              <w:bottom w:val="single" w:sz="4" w:space="0" w:color="DDDDDD"/>
+              <w:right w:val="single" w:sz="4" w:space="0" w:color="DDDDDD"/>
+            </w:tcBorders>
+            <w:tcMar>
+              <w:top w:w="80" w:type="dxa"/>
+              <w:left w:w="120" w:type="dxa"/>
+              <w:bottom w:w="80" w:type="dxa"/>
+              <w:right w:w="120" w:type="dxa"/>
+            </w:tcMar>
+            <w:vAlign w:val="center"/>
+          </w:tcPr>
+          <w:p>
+            <w:pPr>
+              <w:spacing w:after="0"/>
+            </w:pPr>
+            <w:r>
+              <w:rPr>
+                <w:rFonts w:ascii="Wix Madefor Display" w:hAnsi="Wix Madefor Display" w:eastAsia="Wix Madefor Display"/>
+                <w:b w:val="0"/>
+                <w:color w:val="000000"/>
+                <w:sz w:val="16"/>
+              </w:rPr>
+              <w:t>HALT rule</w:t>
+            </w:r>
+          </w:p>
+        </w:tc>
+        <w:tc>
+          <w:tcPr>
+            <w:tcW w:type="dxa" w:w="7500"/>
+            <w:tcBorders>
+              <w:top w:val="single" w:sz="4" w:space="0" w:color="DDDDDD"/>
+              <w:left w:val="single" w:sz="4" w:space="0" w:color="DDDDDD"/>
+              <w:bottom w:val="single" w:sz="4" w:space="0" w:color="DDDDDD"/>
+              <w:right w:val="single" w:sz="4" w:space="0" w:color="DDDDDD"/>
+            </w:tcBorders>
+            <w:tcMar>
+              <w:top w:w="80" w:type="dxa"/>
+              <w:left w:w="120" w:type="dxa"/>
+              <w:bottom w:w="80" w:type="dxa"/>
+              <w:right w:w="120" w:type="dxa"/>
+            </w:tcMar>
+            <w:vAlign w:val="center"/>
+          </w:tcPr>
+          <w:p>
+            <w:pPr>
+              <w:spacing w:after="0"/>
+            </w:pPr>
+            <w:r>
+              <w:rPr>
+                <w:rFonts w:ascii="Wix Madefor Display" w:hAnsi="Wix Madefor Display" w:eastAsia="Wix Madefor Display"/>
+                <w:b w:val="0"/>
+                <w:color w:val="000000"/>
+                <w:sz w:val="16"/>
+              </w:rPr>
+              <w:t>Do not polish unsupported thesis-critical claims. Return HALT when support, arithmetic, source quality, or recurring numbers fail the gate.</w:t>
+            </w:r>
+          </w:p>
+        </w:tc>
+      </w:tr>
+      <w:tr>
+        <w:tc>
+          <w:tcPr>
+            <w:tcW w:type="dxa" w:w="3300"/>
+            <w:tcBorders>
+              <w:top w:val="single" w:sz="4" w:space="0" w:color="DDDDDD"/>
+              <w:left w:val="single" w:sz="4" w:space="0" w:color="DDDDDD"/>
+              <w:bottom w:val="single" w:sz="4" w:space="0" w:color="DDDDDD"/>
+              <w:right w:val="single" w:sz="4" w:space="0" w:color="DDDDDD"/>
+            </w:tcBorders>
+            <w:tcMar>
+              <w:top w:w="80" w:type="dxa"/>
+              <w:left w:w="120" w:type="dxa"/>
+              <w:bottom w:w="80" w:type="dxa"/>
+              <w:right w:w="120" w:type="dxa"/>
+            </w:tcMar>
+            <w:shd w:fill="F5F8FF"/>
+            <w:vAlign w:val="center"/>
+          </w:tcPr>
+          <w:p>
+            <w:pPr>
+              <w:spacing w:after="0"/>
+            </w:pPr>
+            <w:r>
+              <w:rPr>
+                <w:rFonts w:ascii="Wix Madefor Display" w:hAnsi="Wix Madefor Display" w:eastAsia="Wix Madefor Display"/>
+                <w:b w:val="0"/>
+                <w:color w:val="000000"/>
+                <w:sz w:val="16"/>
+              </w:rPr>
+              <w:t>Prompt sequence</w:t>
+            </w:r>
+          </w:p>
+        </w:tc>
+        <w:tc>
+          <w:tcPr>
+            <w:tcW w:type="dxa" w:w="7500"/>
+            <w:tcBorders>
+              <w:top w:val="single" w:sz="4" w:space="0" w:color="DDDDDD"/>
+              <w:left w:val="single" w:sz="4" w:space="0" w:color="DDDDDD"/>
+              <w:bottom w:val="single" w:sz="4" w:space="0" w:color="DDDDDD"/>
+              <w:right w:val="single" w:sz="4" w:space="0" w:color="DDDDDD"/>
+            </w:tcBorders>
+            <w:tcMar>
+              <w:top w:w="80" w:type="dxa"/>
+              <w:left w:w="120" w:type="dxa"/>
+              <w:bottom w:w="80" w:type="dxa"/>
+              <w:right w:w="120" w:type="dxa"/>
+            </w:tcMar>
+            <w:shd w:fill="F5F8FF"/>
+            <w:vAlign w:val="center"/>
+          </w:tcPr>
+          <w:p>
+            <w:pPr>
+              <w:spacing w:after="0"/>
+            </w:pPr>
+            <w:r>
+              <w:rPr>
+                <w:rFonts w:ascii="Wix Madefor Display" w:hAnsi="Wix Madefor Display" w:eastAsia="Wix Madefor Display"/>
+                <w:b w:val="0"/>
+                <w:color w:val="000000"/>
+                <w:sz w:val="16"/>
+              </w:rPr>
+              <w:t>Use docs/new-deal-gold-standard-prompt-sequence.md for checkpointed market research, competitive assessment, IC memo, and cross-output QA.</w:t>
+            </w:r>
+          </w:p>
+        </w:tc>
+      </w:tr>
+    </w:tbl>
+    <w:p/>
+    <w:p>
+      <w:pPr>
+        <w:keepNext/>
+        <w:spacing w:before="200" w:after="100"/>
+      </w:pPr>
+      <w:r>
+        <w:rPr>
+          <w:rFonts w:ascii="Wix Madefor Display SemiBold" w:hAnsi="Wix Madefor Display SemiBold" w:eastAsia="Wix Madefor Display SemiBold"/>
+          <w:b/>
+          <w:color w:val="4280F4"/>
+          <w:sz w:val="24"/>
+        </w:rPr>
         <w:t>Common Mistakes</w:t>
       </w:r>
     </w:p>
@@ -7469,6 +7967,19 @@
           <w:sz w:val="18"/>
         </w:rPr>
         <w:t>Building post-close KPI trees from pre-diligence assumptions without labeling uncertainty.</w:t>
+      </w:r>
+    </w:p>
+    <w:p>
+      <w:pPr>
+        <w:pStyle w:val="ListBullet"/>
+        <w:spacing w:after="40"/>
+      </w:pPr>
+      <w:r>
+        <w:rPr>
+          <w:rFonts w:ascii="Wix Madefor Display" w:hAnsi="Wix Madefor Display" w:eastAsia="Wix Madefor Display"/>
+          <w:sz w:val="18"/>
+        </w:rPr>
+        <w:t>Using manual page-bottom source text instead of true Word footnotes in Pattern DOCX outputs.</w:t>
       </w:r>
     </w:p>
     <w:p>
@@ -7897,6 +8408,140 @@
                 <w:sz w:val="16"/>
               </w:rPr>
               <w:t>Source validation, CRAAP scoring, and triangulation.</w:t>
+            </w:r>
+          </w:p>
+        </w:tc>
+      </w:tr>
+      <w:tr>
+        <w:tc>
+          <w:tcPr>
+            <w:tcW w:type="dxa" w:w="5000"/>
+            <w:tcBorders>
+              <w:top w:val="single" w:sz="4" w:space="0" w:color="DDDDDD"/>
+              <w:left w:val="single" w:sz="4" w:space="0" w:color="DDDDDD"/>
+              <w:bottom w:val="single" w:sz="4" w:space="0" w:color="DDDDDD"/>
+              <w:right w:val="single" w:sz="4" w:space="0" w:color="DDDDDD"/>
+            </w:tcBorders>
+            <w:tcMar>
+              <w:top w:w="80" w:type="dxa"/>
+              <w:left w:w="120" w:type="dxa"/>
+              <w:bottom w:w="80" w:type="dxa"/>
+              <w:right w:w="120" w:type="dxa"/>
+            </w:tcMar>
+            <w:vAlign w:val="center"/>
+          </w:tcPr>
+          <w:p>
+            <w:pPr>
+              <w:spacing w:after="0"/>
+            </w:pPr>
+            <w:r>
+              <w:rPr>
+                <w:rFonts w:ascii="Wix Madefor Display" w:hAnsi="Wix Madefor Display" w:eastAsia="Wix Madefor Display"/>
+                <w:b w:val="0"/>
+                <w:color w:val="000000"/>
+                <w:sz w:val="16"/>
+              </w:rPr>
+              <w:t>docs/new-deal-gold-standard-prompt-sequence.md</w:t>
+            </w:r>
+          </w:p>
+        </w:tc>
+        <w:tc>
+          <w:tcPr>
+            <w:tcW w:type="dxa" w:w="5800"/>
+            <w:tcBorders>
+              <w:top w:val="single" w:sz="4" w:space="0" w:color="DDDDDD"/>
+              <w:left w:val="single" w:sz="4" w:space="0" w:color="DDDDDD"/>
+              <w:bottom w:val="single" w:sz="4" w:space="0" w:color="DDDDDD"/>
+              <w:right w:val="single" w:sz="4" w:space="0" w:color="DDDDDD"/>
+            </w:tcBorders>
+            <w:tcMar>
+              <w:top w:w="80" w:type="dxa"/>
+              <w:left w:w="120" w:type="dxa"/>
+              <w:bottom w:w="80" w:type="dxa"/>
+              <w:right w:w="120" w:type="dxa"/>
+            </w:tcMar>
+            <w:vAlign w:val="center"/>
+          </w:tcPr>
+          <w:p>
+            <w:pPr>
+              <w:spacing w:after="0"/>
+            </w:pPr>
+            <w:r>
+              <w:rPr>
+                <w:rFonts w:ascii="Wix Madefor Display" w:hAnsi="Wix Madefor Display" w:eastAsia="Wix Madefor Display"/>
+                <w:b w:val="0"/>
+                <w:color w:val="000000"/>
+                <w:sz w:val="16"/>
+              </w:rPr>
+              <w:t>Repeatable checkpointed prompt sequence for full deal execution.</w:t>
+            </w:r>
+          </w:p>
+        </w:tc>
+      </w:tr>
+      <w:tr>
+        <w:tc>
+          <w:tcPr>
+            <w:tcW w:type="dxa" w:w="5000"/>
+            <w:tcBorders>
+              <w:top w:val="single" w:sz="4" w:space="0" w:color="DDDDDD"/>
+              <w:left w:val="single" w:sz="4" w:space="0" w:color="DDDDDD"/>
+              <w:bottom w:val="single" w:sz="4" w:space="0" w:color="DDDDDD"/>
+              <w:right w:val="single" w:sz="4" w:space="0" w:color="DDDDDD"/>
+            </w:tcBorders>
+            <w:tcMar>
+              <w:top w:w="80" w:type="dxa"/>
+              <w:left w:w="120" w:type="dxa"/>
+              <w:bottom w:w="80" w:type="dxa"/>
+              <w:right w:w="120" w:type="dxa"/>
+            </w:tcMar>
+            <w:shd w:fill="F5F8FF"/>
+            <w:vAlign w:val="center"/>
+          </w:tcPr>
+          <w:p>
+            <w:pPr>
+              <w:spacing w:after="0"/>
+            </w:pPr>
+            <w:r>
+              <w:rPr>
+                <w:rFonts w:ascii="Wix Madefor Display" w:hAnsi="Wix Madefor Display" w:eastAsia="Wix Madefor Display"/>
+                <w:b w:val="0"/>
+                <w:color w:val="000000"/>
+                <w:sz w:val="16"/>
+              </w:rPr>
+              <w:t>pattern-docx/references/production-spec.md</w:t>
+            </w:r>
+          </w:p>
+        </w:tc>
+        <w:tc>
+          <w:tcPr>
+            <w:tcW w:type="dxa" w:w="5800"/>
+            <w:tcBorders>
+              <w:top w:val="single" w:sz="4" w:space="0" w:color="DDDDDD"/>
+              <w:left w:val="single" w:sz="4" w:space="0" w:color="DDDDDD"/>
+              <w:bottom w:val="single" w:sz="4" w:space="0" w:color="DDDDDD"/>
+              <w:right w:val="single" w:sz="4" w:space="0" w:color="DDDDDD"/>
+            </w:tcBorders>
+            <w:tcMar>
+              <w:top w:w="80" w:type="dxa"/>
+              <w:left w:w="120" w:type="dxa"/>
+              <w:bottom w:w="80" w:type="dxa"/>
+              <w:right w:w="120" w:type="dxa"/>
+            </w:tcMar>
+            <w:shd w:fill="F5F8FF"/>
+            <w:vAlign w:val="center"/>
+          </w:tcPr>
+          <w:p>
+            <w:pPr>
+              <w:spacing w:after="0"/>
+            </w:pPr>
+            <w:r>
+              <w:rPr>
+                <w:rFonts w:ascii="Wix Madefor Display" w:hAnsi="Wix Madefor Display" w:eastAsia="Wix Madefor Display"/>
+                <w:b w:val="0"/>
+                <w:color w:val="000000"/>
+                <w:sz w:val="16"/>
+              </w:rPr>
+              <w:t>True Word footnote implementation standard and Pattern DOCX production details.</w:t>
             </w:r>
           </w:p>
         </w:tc>

</xml_diff>